<commit_message>
feat(ui): add app initialization loader and admin button loading states
</commit_message>
<xml_diff>
--- a/docs/EYC Smart Attendance System — V1 Testing & Feedback Meeting Plan.docx
+++ b/docs/EYC Smart Attendance System — V1 Testing & Feedback Meeting Plan.docx
@@ -79,17 +79,6 @@
     </w:p>
     <w:p>
       <w:r>
-        <w:t xml:space="preserve">Oct 21, 2026 · </w:t>
-      </w:r>
-      <w:r>
-        <w:t xml:space="preserve">by </w:t>
-      </w:r>
-      <w:r>
-        <w:t>@Seakty</w:t>
-      </w:r>
-    </w:p>
-    <w:p>
-      <w:r>
         <w:t>Thank you all for making time. This agenda sets out how we would like to use the session to try out V1 together and decide what comes next.</w:t>
       </w:r>
     </w:p>
@@ -413,33 +402,25 @@
         </w:numPr>
       </w:pPr>
       <w:r>
+        <w:t>The admin web dashboard: viewing attendance, managing staff, and exporting the monthly Excel report.</w:t>
+      </w:r>
+    </w:p>
+    <w:p>
+      <w:pPr>
+        <w:pStyle w:val="ListParagraph"/>
+        <w:numPr>
+          <w:ilvl w:val="0"/>
+          <w:numId w:val="3"/>
+        </w:numPr>
+      </w:pPr>
+      <w:r>
         <w:lastRenderedPageBreak/>
-        <w:t>The admin web dashboard: viewing attendance, managing staff, and exporting the monthly Excel report.</w:t>
-      </w:r>
-    </w:p>
-    <w:p>
-      <w:pPr>
-        <w:pStyle w:val="ListParagraph"/>
-        <w:numPr>
-          <w:ilvl w:val="0"/>
-          <w:numId w:val="3"/>
-        </w:numPr>
-      </w:pPr>
-      <w:r>
         <w:t>A few failure cases, such as trying to check in from outside the allowed area.</w:t>
       </w:r>
     </w:p>
     <w:p>
       <w:r>
-        <w:t xml:space="preserve">The automatic check-out and three-strike rule in the original requirements </w:t>
-      </w:r>
-      <w:proofErr w:type="gramStart"/>
-      <w:r>
-        <w:t>is</w:t>
-      </w:r>
-      <w:proofErr w:type="gramEnd"/>
-      <w:r>
-        <w:t xml:space="preserve"> not part of V1 and will not be tested. We list it below as a possible discussion item for the future.</w:t>
+        <w:t>The automatic check-out and three-strike rule in the original requirements is not part of V1 and will not be tested. We list it below as a possible discussion item for the future.</w:t>
       </w:r>
     </w:p>
     <w:p>
@@ -986,7 +967,6 @@
         <w:rPr>
           <w:b/>
         </w:rPr>
-        <w:lastRenderedPageBreak/>
         <w:t>Future ideas:</w:t>
       </w:r>
       <w:r>
@@ -1005,6 +985,7 @@
         <w:rPr>
           <w:b/>
         </w:rPr>
+        <w:lastRenderedPageBreak/>
         <w:t>Possible future item:</w:t>
       </w:r>
       <w:r>
@@ -1162,15 +1143,7 @@
         </w:numPr>
       </w:pPr>
       <w:r>
-        <w:t xml:space="preserve">A short </w:t>
-      </w:r>
-      <w:proofErr w:type="spellStart"/>
-      <w:r>
-        <w:t>smmary</w:t>
-      </w:r>
-      <w:proofErr w:type="spellEnd"/>
-      <w:r>
-        <w:t xml:space="preserve"> sent to all participants after the meeting.</w:t>
+        <w:t>A short smmary sent to all participants after the meeting.</w:t>
       </w:r>
     </w:p>
     <w:sectPr>

</xml_diff>